<commit_message>
DDS template: header spacing as "MV TESTE  5#" instead of "MV   TESTE 5#"
The bundled template had the placeholder spacing reversed from what the
company prints: one space between MV and the ship name and two between
the ship name and the porão count. The previous version rendered as
"MV   TESTE 5#" — three spaces before the ship, one after.

Pre-processed the template to:
  - Drop the second of the two single-space runs after "MV"
  - Change the "} " run after {NOME_NAVIO} into "}  " (two spaces)

Now renders as "MV TESTE  5#" matching the desired layout.

Co-Authored-By: Claude Opus 4.7 <noreply@anthropic.com>
</commit_message>
<xml_diff>
--- a/src/lib/templates/dds-template.docx
+++ b/src/lib/templates/dds-template.docx
@@ -170,34 +170,12 @@
               <w:rPr>
                 <w:rFonts w:ascii="Times New Roman"/>
                 <w:b/>
-                <w:spacing w:val="-10"/>
-                <w:sz w:val="44"/>
-                <w:szCs w:val="44"/>
-                <w:lang w:val="pt-BR"/>
-              </w:rPr>
-              <w:t xml:space="preserve">  </w:t>
-            </w:r>
-            <w:r>
-              <w:rPr>
-                <w:rFonts w:ascii="Times New Roman"/>
-                <w:b/>
-                <w:spacing w:val="-10"/>
-                <w:sz w:val="44"/>
-                <w:szCs w:val="44"/>
-                <w:lang w:val="pt-BR"/>
-              </w:rPr>
-              <w:t>{</w:t>
-            </w:r>
-            <w:r>
-              <w:rPr>
-                <w:rFonts w:ascii="Times New Roman"/>
-                <w:b/>
                 <w:bCs/>
                 <w:spacing w:val="-10"/>
                 <w:sz w:val="36"/>
-                <w:lang w:val="en-GB"/>
-              </w:rPr>
-              <w:t xml:space="preserve"> </w:t>
+                <w:lang w:val="pt-BR"/>
+              </w:rPr>
+              <w:t>{</w:t>
             </w:r>
             <w:r>
               <w:rPr>
@@ -206,7 +184,7 @@
                 <w:bCs/>
                 <w:spacing w:val="-10"/>
                 <w:sz w:val="36"/>
-                <w:lang w:val="en-GB"/>
+                <w:lang w:val="pt-BR"/>
               </w:rPr>
               <w:t>NOME_NAVIO</w:t>
             </w:r>
@@ -214,23 +192,12 @@
               <w:rPr>
                 <w:rFonts w:ascii="Times New Roman"/>
                 <w:b/>
+                <w:bCs/>
                 <w:spacing w:val="-10"/>
-                <w:sz w:val="44"/>
-                <w:szCs w:val="44"/>
-                <w:lang w:val="pt-BR"/>
-              </w:rPr>
-              <w:t xml:space="preserve"> }</w:t>
-            </w:r>
-            <w:r>
-              <w:rPr>
-                <w:rFonts w:ascii="Times New Roman"/>
-                <w:b/>
-                <w:spacing w:val="-10"/>
-                <w:sz w:val="44"/>
-                <w:szCs w:val="44"/>
-                <w:lang w:val="pt-BR"/>
-              </w:rPr>
-              <w:t xml:space="preserve"> </w:t>
+                <w:sz w:val="36"/>
+                <w:lang w:val="pt-BR"/>
+              </w:rPr>
+              <w:t xml:space="preserve">}  </w:t>
             </w:r>
             <w:r>
               <w:rPr>
@@ -384,7 +351,6 @@
               </w:rPr>
               <w:t xml:space="preserve"> </w:t>
             </w:r>
-            <w:proofErr w:type="spellStart"/>
             <w:r>
               <w:rPr>
                 <w:rFonts w:ascii="Times New Roman" w:hAnsi="Times New Roman"/>
@@ -394,7 +360,6 @@
               </w:rPr>
               <w:t>Ships</w:t>
             </w:r>
-            <w:proofErr w:type="spellEnd"/>
             <w:r>
               <w:rPr>
                 <w:rFonts w:ascii="Times New Roman" w:hAnsi="Times New Roman"/>
@@ -405,7 +370,6 @@
               </w:rPr>
               <w:t xml:space="preserve"> </w:t>
             </w:r>
-            <w:proofErr w:type="spellStart"/>
             <w:r>
               <w:rPr>
                 <w:rFonts w:ascii="Times New Roman" w:hAnsi="Times New Roman"/>
@@ -413,17 +377,7 @@
                 <w:i/>
                 <w:lang w:val="pt-BR"/>
               </w:rPr>
-              <w:t>Cleaning</w:t>
-            </w:r>
-            <w:proofErr w:type="spellEnd"/>
-            <w:r>
-              <w:rPr>
-                <w:rFonts w:ascii="Times New Roman" w:hAnsi="Times New Roman"/>
-                <w:b/>
-                <w:i/>
-                <w:lang w:val="pt-BR"/>
-              </w:rPr>
-              <w:t xml:space="preserve"> Ltda</w:t>
+              <w:t>Cleaning Ltda</w:t>
             </w:r>
             <w:r>
               <w:rPr>
@@ -788,7 +742,6 @@
               </w:rPr>
               <w:t xml:space="preserve"> </w:t>
             </w:r>
-            <w:proofErr w:type="spellStart"/>
             <w:r>
               <w:rPr>
                 <w:rFonts w:ascii="Times New Roman" w:hAnsi="Times New Roman"/>
@@ -798,7 +751,6 @@
               </w:rPr>
               <w:t>Epi´s</w:t>
             </w:r>
-            <w:proofErr w:type="spellEnd"/>
           </w:p>
         </w:tc>
       </w:tr>
@@ -826,7 +778,6 @@
                 <w:sz w:val="28"/>
               </w:rPr>
             </w:pPr>
-            <w:proofErr w:type="spellStart"/>
             <w:r>
               <w:rPr>
                 <w:rFonts w:ascii="Microsoft Himalaya" w:hAnsi="Microsoft Himalaya" w:cs="Microsoft Himalaya"/>
@@ -835,7 +786,6 @@
               </w:rPr>
               <w:t>Navio</w:t>
             </w:r>
-            <w:proofErr w:type="spellEnd"/>
           </w:p>
         </w:tc>
         <w:tc>
@@ -911,23 +861,13 @@
                 <w:sz w:val="28"/>
               </w:rPr>
             </w:pPr>
-            <w:proofErr w:type="spellStart"/>
             <w:r>
               <w:rPr>
                 <w:rFonts w:ascii="Microsoft Himalaya" w:hAnsi="Microsoft Himalaya" w:cs="Microsoft Himalaya"/>
                 <w:spacing w:val="-2"/>
                 <w:sz w:val="28"/>
               </w:rPr>
-              <w:t>Período</w:t>
-            </w:r>
-            <w:proofErr w:type="spellEnd"/>
-            <w:r>
-              <w:rPr>
-                <w:rFonts w:ascii="Microsoft Himalaya" w:hAnsi="Microsoft Himalaya" w:cs="Microsoft Himalaya"/>
-                <w:spacing w:val="-2"/>
-                <w:sz w:val="28"/>
-              </w:rPr>
-              <w:t>:</w:t>
+              <w:t>Período:</w:t>
             </w:r>
           </w:p>
         </w:tc>
@@ -2752,7 +2692,7 @@
             </wp:anchor>
           </w:drawing>
         </mc:Choice>
-        <mc:Fallback xmlns:oel="http://schemas.microsoft.com/office/2019/extlst" xmlns:w16du="http://schemas.microsoft.com/office/word/2023/wordml/word16du" xmlns:w16sdtfl="http://schemas.microsoft.com/office/word/2024/wordml/sdtformatlock">
+        <mc:Fallback xmlns:w16sdtfl="http://schemas.microsoft.com/office/word/2024/wordml/sdtformatlock" xmlns:w16du="http://schemas.microsoft.com/office/word/2023/wordml/word16du" xmlns:oel="http://schemas.microsoft.com/office/2019/extlst">
           <w:pict>
             <v:shape w14:anchorId="463FEBDC" id="AutoShape 2" o:spid="_x0000_s1026" style="position:absolute;margin-left:9.75pt;margin-top:38.35pt;width:564.75pt;height:3.6pt;flip:y;z-index:-251658238;visibility:visible;mso-wrap-style:square;mso-width-percent:0;mso-height-percent:0;mso-wrap-distance-left:9pt;mso-wrap-distance-top:0;mso-wrap-distance-right:9pt;mso-wrap-distance-bottom:0;mso-position-horizontal:absolute;mso-position-horizontal-relative:page;mso-position-vertical:absolute;mso-position-vertical-relative:bottom-margin-area;mso-width-percent:0;mso-height-percent:0;mso-width-relative:page;mso-height-relative:page;v-text-anchor:top" coordsize="9072,221" o:gfxdata="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" path="m4567,l,,,221r4567,l4567,xm9071,l4568,r,221l9071,221,9071,xe" fillcolor="#234060" stroked="f">
               <v:path arrowok="t" o:connecttype="custom" o:connectlocs="3610671,3110961;0,3110961;0,3156680;3610671,3156680;3610671,3110961;7171534,3110961;3611462,3110961;3611462,3156680;7171534,3156680;7171534,3110961" o:connectangles="0,0,0,0,0,0,0,0,0,0"/>
@@ -3194,7 +3134,7 @@
             </wp:anchor>
           </w:drawing>
         </mc:Choice>
-        <mc:Fallback xmlns:oel="http://schemas.microsoft.com/office/2019/extlst" xmlns:w16du="http://schemas.microsoft.com/office/word/2023/wordml/word16du" xmlns:w16sdtfl="http://schemas.microsoft.com/office/word/2024/wordml/sdtformatlock">
+        <mc:Fallback xmlns:w16sdtfl="http://schemas.microsoft.com/office/word/2024/wordml/sdtformatlock" xmlns:w16du="http://schemas.microsoft.com/office/word/2023/wordml/word16du" xmlns:oel="http://schemas.microsoft.com/office/2019/extlst">
           <w:pict>
             <v:shapetype w14:anchorId="255FF3D4" id="_x0000_t202" coordsize="21600,21600" o:spt="202" path="m,l,21600r21600,l21600,xe">
               <v:stroke joinstyle="miter"/>
@@ -3732,7 +3672,7 @@
             </wp:anchor>
           </w:drawing>
         </mc:Choice>
-        <mc:Fallback xmlns:oel="http://schemas.microsoft.com/office/2019/extlst" xmlns:w16du="http://schemas.microsoft.com/office/word/2023/wordml/word16du" xmlns:w16sdtfl="http://schemas.microsoft.com/office/word/2024/wordml/sdtformatlock">
+        <mc:Fallback xmlns:w16sdtfl="http://schemas.microsoft.com/office/word/2024/wordml/sdtformatlock" xmlns:w16du="http://schemas.microsoft.com/office/word/2023/wordml/word16du" xmlns:oel="http://schemas.microsoft.com/office/2019/extlst">
           <w:pict>
             <v:shapetype w14:anchorId="4CEAA9B6" id="_x0000_t202" coordsize="21600,21600" o:spt="202" path="m,l,21600r21600,l21600,xe">
               <v:stroke joinstyle="miter"/>
@@ -4871,6 +4811,85 @@
 </file>
 
 <file path=customXml/item1.xml><?xml version="1.0" encoding="utf-8"?>
+<p:properties xmlns:p="http://schemas.microsoft.com/office/2006/metadata/properties" xmlns:xsi="http://www.w3.org/2001/XMLSchema-instance" xmlns:pc="http://schemas.microsoft.com/office/infopath/2007/PartnerControls">
+  <documentManagement>
+    <TaxCatchAll xmlns="80a27987-d45b-4cd4-b8a7-16ed02eb556a" xsi:nil="true"/>
+    <lcf76f155ced4ddcb4097134ff3c332f xmlns="80338f9d-91b9-4810-91ce-b0884f25b100">
+      <Terms xmlns="http://schemas.microsoft.com/office/infopath/2007/PartnerControls"/>
+    </lcf76f155ced4ddcb4097134ff3c332f>
+    <_dlc_DocId xmlns="80a27987-d45b-4cd4-b8a7-16ed02eb556a">AUXV76FC3EPN-808461318-38468</_dlc_DocId>
+    <_dlc_DocIdUrl xmlns="80a27987-d45b-4cd4-b8a7-16ed02eb556a">
+      <Url>https://cargoships.sharepoint.com/sites/SERVIDOR/_layouts/15/DocIdRedir.aspx?ID=AUXV76FC3EPN-808461318-38468</Url>
+      <Description>AUXV76FC3EPN-808461318-38468</Description>
+    </_dlc_DocIdUrl>
+  </documentManagement>
+</p:properties>
+</file>
+
+<file path=customXml/item2.xml><?xml version="1.0" encoding="utf-8"?>
+<b:Sources xmlns:b="http://schemas.openxmlformats.org/officeDocument/2006/bibliography" xmlns="http://schemas.openxmlformats.org/officeDocument/2006/bibliography" SelectedStyle="\APASixthEditionOfficeOnline.xsl" StyleName="APA" Version="6"/>
+</file>
+
+<file path=customXml/item3.xml><?xml version="1.0" encoding="utf-8"?>
+<?mso-contentType ?>
+<spe:Receivers xmlns:spe="http://schemas.microsoft.com/sharepoint/events">
+  <Receiver>
+    <Name>Document ID Generator</Name>
+    <Synchronization>Synchronous</Synchronization>
+    <Type>10001</Type>
+    <SequenceNumber>1000</SequenceNumber>
+    <Url/>
+    <Assembly>Microsoft.Office.DocumentManagement, Version=16.0.0.0, Culture=neutral, PublicKeyToken=71e9bce111e9429c</Assembly>
+    <Class>Microsoft.Office.DocumentManagement.Internal.DocIdHandler</Class>
+    <Data/>
+    <Filter/>
+  </Receiver>
+  <Receiver>
+    <Name>Document ID Generator</Name>
+    <Synchronization>Synchronous</Synchronization>
+    <Type>10002</Type>
+    <SequenceNumber>1001</SequenceNumber>
+    <Url/>
+    <Assembly>Microsoft.Office.DocumentManagement, Version=16.0.0.0, Culture=neutral, PublicKeyToken=71e9bce111e9429c</Assembly>
+    <Class>Microsoft.Office.DocumentManagement.Internal.DocIdHandler</Class>
+    <Data/>
+    <Filter/>
+  </Receiver>
+  <Receiver>
+    <Name>Document ID Generator</Name>
+    <Synchronization>Synchronous</Synchronization>
+    <Type>10004</Type>
+    <SequenceNumber>1002</SequenceNumber>
+    <Url/>
+    <Assembly>Microsoft.Office.DocumentManagement, Version=16.0.0.0, Culture=neutral, PublicKeyToken=71e9bce111e9429c</Assembly>
+    <Class>Microsoft.Office.DocumentManagement.Internal.DocIdHandler</Class>
+    <Data/>
+    <Filter/>
+  </Receiver>
+  <Receiver>
+    <Name>Document ID Generator</Name>
+    <Synchronization>Synchronous</Synchronization>
+    <Type>10006</Type>
+    <SequenceNumber>1003</SequenceNumber>
+    <Url/>
+    <Assembly>Microsoft.Office.DocumentManagement, Version=16.0.0.0, Culture=neutral, PublicKeyToken=71e9bce111e9429c</Assembly>
+    <Class>Microsoft.Office.DocumentManagement.Internal.DocIdHandler</Class>
+    <Data/>
+    <Filter/>
+  </Receiver>
+</spe:Receivers>
+</file>
+
+<file path=customXml/item4.xml><?xml version="1.0" encoding="utf-8"?>
+<?mso-contentType ?>
+<FormTemplates xmlns="http://schemas.microsoft.com/sharepoint/v3/contenttype/forms">
+  <Display>DocumentLibraryForm</Display>
+  <Edit>DocumentLibraryForm</Edit>
+  <New>DocumentLibraryForm</New>
+</FormTemplates>
+</file>
+
+<file path=customXml/item5.xml><?xml version="1.0" encoding="utf-8"?>
 <ct:contentTypeSchema xmlns:ct="http://schemas.microsoft.com/office/2006/metadata/contentType" xmlns:ma="http://schemas.microsoft.com/office/2006/metadata/properties/metaAttributes" ct:_="" ma:_="" ma:contentTypeName="Documento" ma:contentTypeID="0x010100206D6FDB071234409456CC10EC397D4E" ma:contentTypeVersion="15" ma:contentTypeDescription="Crie um novo documento." ma:contentTypeScope="" ma:versionID="afa1fc604ee9be6a101c8a9b5ab35733">
   <xsd:schema xmlns:xsd="http://www.w3.org/2001/XMLSchema" xmlns:xs="http://www.w3.org/2001/XMLSchema" xmlns:p="http://schemas.microsoft.com/office/2006/metadata/properties" xmlns:ns2="80a27987-d45b-4cd4-b8a7-16ed02eb556a" xmlns:ns3="80338f9d-91b9-4810-91ce-b0884f25b100" targetNamespace="http://schemas.microsoft.com/office/2006/metadata/properties" ma:root="true" ma:fieldsID="ea679b8e094bfb2ba41312958bdaaabd" ns2:_="" ns3:_="">
     <xsd:import namespace="80a27987-d45b-4cd4-b8a7-16ed02eb556a"/>
@@ -5130,86 +5149,42 @@
 </ct:contentTypeSchema>
 </file>
 
-<file path=customXml/item2.xml><?xml version="1.0" encoding="utf-8"?>
-<?mso-contentType ?>
-<FormTemplates xmlns="http://schemas.microsoft.com/sharepoint/v3/contenttype/forms">
-  <Display>DocumentLibraryForm</Display>
-  <Edit>DocumentLibraryForm</Edit>
-  <New>DocumentLibraryForm</New>
-</FormTemplates>
+<file path=customXml/itemProps1.xml><?xml version="1.0" encoding="utf-8"?>
+<ds:datastoreItem xmlns:ds="http://schemas.openxmlformats.org/officeDocument/2006/customXml" ds:itemID="{70045B2F-DD16-4055-AC8B-8E65C3AB9E0D}">
+  <ds:schemaRefs>
+    <ds:schemaRef ds:uri="http://schemas.microsoft.com/office/2006/metadata/properties"/>
+    <ds:schemaRef ds:uri="http://schemas.microsoft.com/office/infopath/2007/PartnerControls"/>
+    <ds:schemaRef ds:uri="80a27987-d45b-4cd4-b8a7-16ed02eb556a"/>
+    <ds:schemaRef ds:uri="80338f9d-91b9-4810-91ce-b0884f25b100"/>
+  </ds:schemaRefs>
+</ds:datastoreItem>
 </file>
 
-<file path=customXml/item3.xml><?xml version="1.0" encoding="utf-8"?>
-<?mso-contentType ?>
-<spe:Receivers xmlns:spe="http://schemas.microsoft.com/sharepoint/events">
-  <Receiver>
-    <Name>Document ID Generator</Name>
-    <Synchronization>Synchronous</Synchronization>
-    <Type>10001</Type>
-    <SequenceNumber>1000</SequenceNumber>
-    <Url/>
-    <Assembly>Microsoft.Office.DocumentManagement, Version=16.0.0.0, Culture=neutral, PublicKeyToken=71e9bce111e9429c</Assembly>
-    <Class>Microsoft.Office.DocumentManagement.Internal.DocIdHandler</Class>
-    <Data/>
-    <Filter/>
-  </Receiver>
-  <Receiver>
-    <Name>Document ID Generator</Name>
-    <Synchronization>Synchronous</Synchronization>
-    <Type>10002</Type>
-    <SequenceNumber>1001</SequenceNumber>
-    <Url/>
-    <Assembly>Microsoft.Office.DocumentManagement, Version=16.0.0.0, Culture=neutral, PublicKeyToken=71e9bce111e9429c</Assembly>
-    <Class>Microsoft.Office.DocumentManagement.Internal.DocIdHandler</Class>
-    <Data/>
-    <Filter/>
-  </Receiver>
-  <Receiver>
-    <Name>Document ID Generator</Name>
-    <Synchronization>Synchronous</Synchronization>
-    <Type>10004</Type>
-    <SequenceNumber>1002</SequenceNumber>
-    <Url/>
-    <Assembly>Microsoft.Office.DocumentManagement, Version=16.0.0.0, Culture=neutral, PublicKeyToken=71e9bce111e9429c</Assembly>
-    <Class>Microsoft.Office.DocumentManagement.Internal.DocIdHandler</Class>
-    <Data/>
-    <Filter/>
-  </Receiver>
-  <Receiver>
-    <Name>Document ID Generator</Name>
-    <Synchronization>Synchronous</Synchronization>
-    <Type>10006</Type>
-    <SequenceNumber>1003</SequenceNumber>
-    <Url/>
-    <Assembly>Microsoft.Office.DocumentManagement, Version=16.0.0.0, Culture=neutral, PublicKeyToken=71e9bce111e9429c</Assembly>
-    <Class>Microsoft.Office.DocumentManagement.Internal.DocIdHandler</Class>
-    <Data/>
-    <Filter/>
-  </Receiver>
-</spe:Receivers>
+<file path=customXml/itemProps2.xml><?xml version="1.0" encoding="utf-8"?>
+<ds:datastoreItem xmlns:ds="http://schemas.openxmlformats.org/officeDocument/2006/customXml" ds:itemID="{E19637D7-3421-4B71-A5DE-43097A966CDC}">
+  <ds:schemaRefs>
+    <ds:schemaRef ds:uri="http://schemas.openxmlformats.org/officeDocument/2006/bibliography"/>
+  </ds:schemaRefs>
+</ds:datastoreItem>
 </file>
 
-<file path=customXml/item4.xml><?xml version="1.0" encoding="utf-8"?>
-<b:Sources xmlns:b="http://schemas.openxmlformats.org/officeDocument/2006/bibliography" xmlns="http://schemas.openxmlformats.org/officeDocument/2006/bibliography" SelectedStyle="\APASixthEditionOfficeOnline.xsl" StyleName="APA" Version="6"/>
+<file path=customXml/itemProps3.xml><?xml version="1.0" encoding="utf-8"?>
+<ds:datastoreItem xmlns:ds="http://schemas.openxmlformats.org/officeDocument/2006/customXml" ds:itemID="{C136CDCD-886A-4D6D-AD8C-EEFAADB4EC4B}">
+  <ds:schemaRefs>
+    <ds:schemaRef ds:uri="http://schemas.microsoft.com/sharepoint/events"/>
+  </ds:schemaRefs>
+</ds:datastoreItem>
 </file>
 
-<file path=customXml/item5.xml><?xml version="1.0" encoding="utf-8"?>
-<p:properties xmlns:p="http://schemas.microsoft.com/office/2006/metadata/properties" xmlns:xsi="http://www.w3.org/2001/XMLSchema-instance" xmlns:pc="http://schemas.microsoft.com/office/infopath/2007/PartnerControls">
-  <documentManagement>
-    <TaxCatchAll xmlns="80a27987-d45b-4cd4-b8a7-16ed02eb556a" xsi:nil="true"/>
-    <lcf76f155ced4ddcb4097134ff3c332f xmlns="80338f9d-91b9-4810-91ce-b0884f25b100">
-      <Terms xmlns="http://schemas.microsoft.com/office/infopath/2007/PartnerControls"/>
-    </lcf76f155ced4ddcb4097134ff3c332f>
-    <_dlc_DocId xmlns="80a27987-d45b-4cd4-b8a7-16ed02eb556a">AUXV76FC3EPN-808461318-38468</_dlc_DocId>
-    <_dlc_DocIdUrl xmlns="80a27987-d45b-4cd4-b8a7-16ed02eb556a">
-      <Url>https://cargoships.sharepoint.com/sites/SERVIDOR/_layouts/15/DocIdRedir.aspx?ID=AUXV76FC3EPN-808461318-38468</Url>
-      <Description>AUXV76FC3EPN-808461318-38468</Description>
-    </_dlc_DocIdUrl>
-  </documentManagement>
-</p:properties>
+<file path=customXml/itemProps4.xml><?xml version="1.0" encoding="utf-8"?>
+<ds:datastoreItem xmlns:ds="http://schemas.openxmlformats.org/officeDocument/2006/customXml" ds:itemID="{CD845960-11CF-4801-9B2E-2B2A08E5AC2C}">
+  <ds:schemaRefs>
+    <ds:schemaRef ds:uri="http://schemas.microsoft.com/sharepoint/v3/contenttype/forms"/>
+  </ds:schemaRefs>
+</ds:datastoreItem>
 </file>
 
-<file path=customXml/itemProps1.xml><?xml version="1.0" encoding="utf-8"?>
+<file path=customXml/itemProps5.xml><?xml version="1.0" encoding="utf-8"?>
 <ds:datastoreItem xmlns:ds="http://schemas.openxmlformats.org/officeDocument/2006/customXml" ds:itemID="{0C364CAD-5404-41F0-A91E-C0871EB95AF6}">
   <ds:schemaRefs>
     <ds:schemaRef ds:uri="http://schemas.microsoft.com/office/2006/metadata/contentType"/>
@@ -5226,39 +5201,4 @@
     <ds:schemaRef ds:uri="http://schemas.microsoft.com/internal/obd"/>
   </ds:schemaRefs>
 </ds:datastoreItem>
-</file>
-
-<file path=customXml/itemProps2.xml><?xml version="1.0" encoding="utf-8"?>
-<ds:datastoreItem xmlns:ds="http://schemas.openxmlformats.org/officeDocument/2006/customXml" ds:itemID="{CD845960-11CF-4801-9B2E-2B2A08E5AC2C}">
-  <ds:schemaRefs>
-    <ds:schemaRef ds:uri="http://schemas.microsoft.com/sharepoint/v3/contenttype/forms"/>
-  </ds:schemaRefs>
-</ds:datastoreItem>
-</file>
-
-<file path=customXml/itemProps3.xml><?xml version="1.0" encoding="utf-8"?>
-<ds:datastoreItem xmlns:ds="http://schemas.openxmlformats.org/officeDocument/2006/customXml" ds:itemID="{C136CDCD-886A-4D6D-AD8C-EEFAADB4EC4B}">
-  <ds:schemaRefs>
-    <ds:schemaRef ds:uri="http://schemas.microsoft.com/sharepoint/events"/>
-  </ds:schemaRefs>
-</ds:datastoreItem>
-</file>
-
-<file path=customXml/itemProps4.xml><?xml version="1.0" encoding="utf-8"?>
-<ds:datastoreItem xmlns:ds="http://schemas.openxmlformats.org/officeDocument/2006/customXml" ds:itemID="{E19637D7-3421-4B71-A5DE-43097A966CDC}">
-  <ds:schemaRefs>
-    <ds:schemaRef ds:uri="http://schemas.openxmlformats.org/officeDocument/2006/bibliography"/>
-  </ds:schemaRefs>
-</ds:datastoreItem>
-</file>
-
-<file path=customXml/itemProps5.xml><?xml version="1.0" encoding="utf-8"?>
-<ds:datastoreItem xmlns:ds="http://schemas.openxmlformats.org/officeDocument/2006/customXml" ds:itemID="{70045B2F-DD16-4055-AC8B-8E65C3AB9E0D}">
-  <ds:schemaRefs>
-    <ds:schemaRef ds:uri="http://schemas.microsoft.com/office/2006/metadata/properties"/>
-    <ds:schemaRef ds:uri="http://schemas.microsoft.com/office/infopath/2007/PartnerControls"/>
-    <ds:schemaRef ds:uri="80a27987-d45b-4cd4-b8a7-16ed02eb556a"/>
-    <ds:schemaRef ds:uri="80338f9d-91b9-4810-91ce-b0884f25b100"/>
-  </ds:schemaRefs>
-</ds:datastoreItem>
 </file>
</xml_diff>

<commit_message>
DDS template: normalize banner font size to 22pt across the row
The {NOME_NAVIO} placeholder runs in the header banner were authored at
sz=36 (18pt) while everything else in the row sat at sz=44 (22pt), so
the substituted ship name rendered noticeably smaller than DDS and the
date. Promoted every w:sz / w:szCs in the banner row to 44 in the
preprocess step so the whole header reads at the same 22pt size.

Co-Authored-By: Claude Opus 4.7 <noreply@anthropic.com>
</commit_message>
<xml_diff>
--- a/src/lib/templates/dds-template.docx
+++ b/src/lib/templates/dds-template.docx
@@ -172,7 +172,7 @@
                 <w:b/>
                 <w:bCs/>
                 <w:spacing w:val="-10"/>
-                <w:sz w:val="36"/>
+                <w:sz w:val="44"/>
                 <w:lang w:val="pt-BR"/>
               </w:rPr>
               <w:t>{</w:t>
@@ -183,7 +183,7 @@
                 <w:b/>
                 <w:bCs/>
                 <w:spacing w:val="-10"/>
-                <w:sz w:val="36"/>
+                <w:sz w:val="44"/>
                 <w:lang w:val="pt-BR"/>
               </w:rPr>
               <w:t>NOME_NAVIO</w:t>
@@ -194,7 +194,7 @@
                 <w:b/>
                 <w:bCs/>
                 <w:spacing w:val="-10"/>
-                <w:sz w:val="36"/>
+                <w:sz w:val="44"/>
                 <w:lang w:val="pt-BR"/>
               </w:rPr>
               <w:t xml:space="preserve">}  </w:t>

</xml_diff>